<commit_message>
chore: update delivery  plan
</commit_message>
<xml_diff>
--- a/ScrabbleScoreboard.Documentation/journal/DeliveryPlan.docx
+++ b/ScrabbleScoreboard.Documentation/journal/DeliveryPlan.docx
@@ -496,6 +496,38 @@
         <w:pStyle w:val="Heading3"/>
       </w:pPr>
       <w:r>
+        <w:t>Unit Test Generation Using AI</w:t>
+      </w:r>
+    </w:p>
+    <w:p>
+      <w:pPr>
+        <w:pStyle w:val="ListParagraph"/>
+        <w:numPr>
+          <w:ilvl w:val="0"/>
+          <w:numId w:val="13"/>
+        </w:numPr>
+      </w:pPr>
+      <w:r>
+        <w:t>Use integrated AI to find gaps in manually written test coverage</w:t>
+      </w:r>
+    </w:p>
+    <w:p>
+      <w:pPr>
+        <w:pStyle w:val="ListParagraph"/>
+        <w:numPr>
+          <w:ilvl w:val="0"/>
+          <w:numId w:val="13"/>
+        </w:numPr>
+      </w:pPr>
+      <w:r>
+        <w:t>Generate tests, ensure AI has been properly instructed on patterns</w:t>
+      </w:r>
+    </w:p>
+    <w:p>
+      <w:pPr>
+        <w:pStyle w:val="Heading3"/>
+      </w:pPr>
+      <w:r>
         <w:t> Persistence</w:t>
       </w:r>
     </w:p>
@@ -614,6 +646,7 @@
         <w:pStyle w:val="Heading2"/>
       </w:pPr>
       <w:r>
+        <w:lastRenderedPageBreak/>
         <w:t>Skills Development</w:t>
       </w:r>
     </w:p>
@@ -644,7 +677,6 @@
         </w:numPr>
       </w:pPr>
       <w:r>
-        <w:lastRenderedPageBreak/>
         <w:t>Introductory course for RabbitMQ - use manufacturers</w:t>
       </w:r>
     </w:p>
@@ -968,6 +1000,119 @@
 <file path=word/numbering.xml><?xml version="1.0" encoding="utf-8"?>
 <w:numbering xmlns:wpc="http://schemas.microsoft.com/office/word/2010/wordprocessingCanvas" xmlns:cx="http://schemas.microsoft.com/office/drawing/2014/chartex" xmlns:cx1="http://schemas.microsoft.com/office/drawing/2015/9/8/chartex" xmlns:cx2="http://schemas.microsoft.com/office/drawing/2015/10/21/chartex" xmlns:cx3="http://schemas.microsoft.com/office/drawing/2016/5/9/chartex" xmlns:cx4="http://schemas.microsoft.com/office/drawing/2016/5/10/chartex" xmlns:cx5="http://schemas.microsoft.com/office/drawing/2016/5/11/chartex" xmlns:cx6="http://schemas.microsoft.com/office/drawing/2016/5/12/chartex" xmlns:cx7="http://schemas.microsoft.com/office/drawing/2016/5/13/chartex" xmlns:cx8="http://schemas.microsoft.com/office/drawing/2016/5/14/chartex" xmlns:mc="http://schemas.openxmlformats.org/markup-compatibility/2006" xmlns:aink="http://schemas.microsoft.com/office/drawing/2016/ink" xmlns:am3d="http://schemas.microsoft.com/office/drawing/2017/model3d" xmlns:o="urn:schemas-microsoft-com:office:office" xmlns:oel="http://schemas.microsoft.com/office/2019/extlst" xmlns:r="http://schemas.openxmlformats.org/officeDocument/2006/relationships" xmlns:m="http://schemas.openxmlformats.org/officeDocument/2006/math" xmlns:v="urn:schemas-microsoft-com:vml" xmlns:wp14="http://schemas.microsoft.com/office/word/2010/wordprocessingDrawing" xmlns:wp="http://schemas.openxmlformats.org/drawingml/2006/wordprocessingDrawing" xmlns:w10="urn:schemas-microsoft-com:office:word" xmlns:w="http://schemas.openxmlformats.org/wordprocessingml/2006/main" xmlns:w14="http://schemas.microsoft.com/office/word/2010/wordml" xmlns:w15="http://schemas.microsoft.com/office/word/2012/wordml" xmlns:w16cex="http://schemas.microsoft.com/office/word/2018/wordml/cex" xmlns:w16cid="http://schemas.microsoft.com/office/word/2016/wordml/cid" xmlns:w16="http://schemas.microsoft.com/office/word/2018/wordml" xmlns:w16du="http://schemas.microsoft.com/office/word/2023/wordml/word16du" xmlns:w16sdtdh="http://schemas.microsoft.com/office/word/2020/wordml/sdtdatahash" xmlns:w16sdtfl="http://schemas.microsoft.com/office/word/2024/wordml/sdtformatlock" xmlns:w16se="http://schemas.microsoft.com/office/word/2015/wordml/symex" xmlns:wpg="http://schemas.microsoft.com/office/word/2010/wordprocessingGroup" xmlns:wpi="http://schemas.microsoft.com/office/word/2010/wordprocessingInk" xmlns:wne="http://schemas.microsoft.com/office/word/2006/wordml" xmlns:wps="http://schemas.microsoft.com/office/word/2010/wordprocessingShape" mc:Ignorable="w14 w15 w16se w16cid w16 w16cex w16sdtdh w16sdtfl w16du wp14">
   <w:abstractNum w:abstractNumId="0" w15:restartNumberingAfterBreak="0">
+    <w:nsid w:val="0A4A6A29"/>
+    <w:multiLevelType w:val="hybridMultilevel"/>
+    <w:tmpl w:val="C4CC5B4A"/>
+    <w:lvl w:ilvl="0" w:tplc="08090001">
+      <w:start w:val="1"/>
+      <w:numFmt w:val="bullet"/>
+      <w:lvlText w:val=""/>
+      <w:lvlJc w:val="left"/>
+      <w:pPr>
+        <w:ind w:left="720" w:hanging="360"/>
+      </w:pPr>
+      <w:rPr>
+        <w:rFonts w:ascii="Symbol" w:hAnsi="Symbol" w:hint="default"/>
+      </w:rPr>
+    </w:lvl>
+    <w:lvl w:ilvl="1" w:tplc="08090003" w:tentative="1">
+      <w:start w:val="1"/>
+      <w:numFmt w:val="bullet"/>
+      <w:lvlText w:val="o"/>
+      <w:lvlJc w:val="left"/>
+      <w:pPr>
+        <w:ind w:left="1440" w:hanging="360"/>
+      </w:pPr>
+      <w:rPr>
+        <w:rFonts w:ascii="Courier New" w:hAnsi="Courier New" w:cs="Courier New" w:hint="default"/>
+      </w:rPr>
+    </w:lvl>
+    <w:lvl w:ilvl="2" w:tplc="08090005" w:tentative="1">
+      <w:start w:val="1"/>
+      <w:numFmt w:val="bullet"/>
+      <w:lvlText w:val=""/>
+      <w:lvlJc w:val="left"/>
+      <w:pPr>
+        <w:ind w:left="2160" w:hanging="360"/>
+      </w:pPr>
+      <w:rPr>
+        <w:rFonts w:ascii="Wingdings" w:hAnsi="Wingdings" w:hint="default"/>
+      </w:rPr>
+    </w:lvl>
+    <w:lvl w:ilvl="3" w:tplc="08090001" w:tentative="1">
+      <w:start w:val="1"/>
+      <w:numFmt w:val="bullet"/>
+      <w:lvlText w:val=""/>
+      <w:lvlJc w:val="left"/>
+      <w:pPr>
+        <w:ind w:left="2880" w:hanging="360"/>
+      </w:pPr>
+      <w:rPr>
+        <w:rFonts w:ascii="Symbol" w:hAnsi="Symbol" w:hint="default"/>
+      </w:rPr>
+    </w:lvl>
+    <w:lvl w:ilvl="4" w:tplc="08090003" w:tentative="1">
+      <w:start w:val="1"/>
+      <w:numFmt w:val="bullet"/>
+      <w:lvlText w:val="o"/>
+      <w:lvlJc w:val="left"/>
+      <w:pPr>
+        <w:ind w:left="3600" w:hanging="360"/>
+      </w:pPr>
+      <w:rPr>
+        <w:rFonts w:ascii="Courier New" w:hAnsi="Courier New" w:cs="Courier New" w:hint="default"/>
+      </w:rPr>
+    </w:lvl>
+    <w:lvl w:ilvl="5" w:tplc="08090005" w:tentative="1">
+      <w:start w:val="1"/>
+      <w:numFmt w:val="bullet"/>
+      <w:lvlText w:val=""/>
+      <w:lvlJc w:val="left"/>
+      <w:pPr>
+        <w:ind w:left="4320" w:hanging="360"/>
+      </w:pPr>
+      <w:rPr>
+        <w:rFonts w:ascii="Wingdings" w:hAnsi="Wingdings" w:hint="default"/>
+      </w:rPr>
+    </w:lvl>
+    <w:lvl w:ilvl="6" w:tplc="08090001" w:tentative="1">
+      <w:start w:val="1"/>
+      <w:numFmt w:val="bullet"/>
+      <w:lvlText w:val=""/>
+      <w:lvlJc w:val="left"/>
+      <w:pPr>
+        <w:ind w:left="5040" w:hanging="360"/>
+      </w:pPr>
+      <w:rPr>
+        <w:rFonts w:ascii="Symbol" w:hAnsi="Symbol" w:hint="default"/>
+      </w:rPr>
+    </w:lvl>
+    <w:lvl w:ilvl="7" w:tplc="08090003" w:tentative="1">
+      <w:start w:val="1"/>
+      <w:numFmt w:val="bullet"/>
+      <w:lvlText w:val="o"/>
+      <w:lvlJc w:val="left"/>
+      <w:pPr>
+        <w:ind w:left="5760" w:hanging="360"/>
+      </w:pPr>
+      <w:rPr>
+        <w:rFonts w:ascii="Courier New" w:hAnsi="Courier New" w:cs="Courier New" w:hint="default"/>
+      </w:rPr>
+    </w:lvl>
+    <w:lvl w:ilvl="8" w:tplc="08090005" w:tentative="1">
+      <w:start w:val="1"/>
+      <w:numFmt w:val="bullet"/>
+      <w:lvlText w:val=""/>
+      <w:lvlJc w:val="left"/>
+      <w:pPr>
+        <w:ind w:left="6480" w:hanging="360"/>
+      </w:pPr>
+      <w:rPr>
+        <w:rFonts w:ascii="Wingdings" w:hAnsi="Wingdings" w:hint="default"/>
+      </w:rPr>
+    </w:lvl>
+  </w:abstractNum>
+  <w:abstractNum w:abstractNumId="1" w15:restartNumberingAfterBreak="0">
     <w:nsid w:val="0E905B12"/>
     <w:multiLevelType w:val="multilevel"/>
     <w:tmpl w:val="29B8DBFC"/>
@@ -1116,7 +1261,7 @@
       </w:rPr>
     </w:lvl>
   </w:abstractNum>
-  <w:abstractNum w:abstractNumId="1" w15:restartNumberingAfterBreak="0">
+  <w:abstractNum w:abstractNumId="2" w15:restartNumberingAfterBreak="0">
     <w:nsid w:val="22777A45"/>
     <w:multiLevelType w:val="multilevel"/>
     <w:tmpl w:val="FA565A16"/>
@@ -1265,7 +1410,7 @@
       </w:rPr>
     </w:lvl>
   </w:abstractNum>
-  <w:abstractNum w:abstractNumId="2" w15:restartNumberingAfterBreak="0">
+  <w:abstractNum w:abstractNumId="3" w15:restartNumberingAfterBreak="0">
     <w:nsid w:val="30502BE5"/>
     <w:multiLevelType w:val="multilevel"/>
     <w:tmpl w:val="56CE99CE"/>
@@ -1414,7 +1559,7 @@
       </w:rPr>
     </w:lvl>
   </w:abstractNum>
-  <w:abstractNum w:abstractNumId="3" w15:restartNumberingAfterBreak="0">
+  <w:abstractNum w:abstractNumId="4" w15:restartNumberingAfterBreak="0">
     <w:nsid w:val="331157DC"/>
     <w:multiLevelType w:val="multilevel"/>
     <w:tmpl w:val="D07241DA"/>
@@ -1563,7 +1708,7 @@
       </w:rPr>
     </w:lvl>
   </w:abstractNum>
-  <w:abstractNum w:abstractNumId="4" w15:restartNumberingAfterBreak="0">
+  <w:abstractNum w:abstractNumId="5" w15:restartNumberingAfterBreak="0">
     <w:nsid w:val="390E1474"/>
     <w:multiLevelType w:val="multilevel"/>
     <w:tmpl w:val="C16CC60C"/>
@@ -1712,7 +1857,7 @@
       </w:rPr>
     </w:lvl>
   </w:abstractNum>
-  <w:abstractNum w:abstractNumId="5" w15:restartNumberingAfterBreak="0">
+  <w:abstractNum w:abstractNumId="6" w15:restartNumberingAfterBreak="0">
     <w:nsid w:val="528E5930"/>
     <w:multiLevelType w:val="multilevel"/>
     <w:tmpl w:val="B500361A"/>
@@ -1861,7 +2006,7 @@
       </w:rPr>
     </w:lvl>
   </w:abstractNum>
-  <w:abstractNum w:abstractNumId="6" w15:restartNumberingAfterBreak="0">
+  <w:abstractNum w:abstractNumId="7" w15:restartNumberingAfterBreak="0">
     <w:nsid w:val="55FE34C0"/>
     <w:multiLevelType w:val="hybridMultilevel"/>
     <w:tmpl w:val="C1DCBFC2"/>
@@ -1974,7 +2119,7 @@
       </w:rPr>
     </w:lvl>
   </w:abstractNum>
-  <w:abstractNum w:abstractNumId="7" w15:restartNumberingAfterBreak="0">
+  <w:abstractNum w:abstractNumId="8" w15:restartNumberingAfterBreak="0">
     <w:nsid w:val="58224F2A"/>
     <w:multiLevelType w:val="multilevel"/>
     <w:tmpl w:val="9A0EA4D2"/>
@@ -2123,7 +2268,7 @@
       </w:rPr>
     </w:lvl>
   </w:abstractNum>
-  <w:abstractNum w:abstractNumId="8" w15:restartNumberingAfterBreak="0">
+  <w:abstractNum w:abstractNumId="9" w15:restartNumberingAfterBreak="0">
     <w:nsid w:val="596A054F"/>
     <w:multiLevelType w:val="multilevel"/>
     <w:tmpl w:val="C0BC5DCA"/>
@@ -2272,7 +2417,7 @@
       </w:rPr>
     </w:lvl>
   </w:abstractNum>
-  <w:abstractNum w:abstractNumId="9" w15:restartNumberingAfterBreak="0">
+  <w:abstractNum w:abstractNumId="10" w15:restartNumberingAfterBreak="0">
     <w:nsid w:val="59A8395B"/>
     <w:multiLevelType w:val="multilevel"/>
     <w:tmpl w:val="2872162C"/>
@@ -2421,7 +2566,7 @@
       </w:rPr>
     </w:lvl>
   </w:abstractNum>
-  <w:abstractNum w:abstractNumId="10" w15:restartNumberingAfterBreak="0">
+  <w:abstractNum w:abstractNumId="11" w15:restartNumberingAfterBreak="0">
     <w:nsid w:val="64F42ADC"/>
     <w:multiLevelType w:val="multilevel"/>
     <w:tmpl w:val="058C37E4"/>
@@ -2570,7 +2715,7 @@
       </w:rPr>
     </w:lvl>
   </w:abstractNum>
-  <w:abstractNum w:abstractNumId="11" w15:restartNumberingAfterBreak="0">
+  <w:abstractNum w:abstractNumId="12" w15:restartNumberingAfterBreak="0">
     <w:nsid w:val="6A144B97"/>
     <w:multiLevelType w:val="multilevel"/>
     <w:tmpl w:val="422010E4"/>
@@ -2720,40 +2865,43 @@
     </w:lvl>
   </w:abstractNum>
   <w:num w:numId="1" w16cid:durableId="974336907">
+    <w:abstractNumId w:val="2"/>
+  </w:num>
+  <w:num w:numId="2" w16cid:durableId="37895987">
     <w:abstractNumId w:val="1"/>
   </w:num>
-  <w:num w:numId="2" w16cid:durableId="37895987">
-    <w:abstractNumId w:val="0"/>
+  <w:num w:numId="3" w16cid:durableId="915748274">
+    <w:abstractNumId w:val="9"/>
   </w:num>
-  <w:num w:numId="3" w16cid:durableId="915748274">
+  <w:num w:numId="4" w16cid:durableId="2004159467">
+    <w:abstractNumId w:val="3"/>
+  </w:num>
+  <w:num w:numId="5" w16cid:durableId="999313764">
+    <w:abstractNumId w:val="11"/>
+  </w:num>
+  <w:num w:numId="6" w16cid:durableId="1634479605">
+    <w:abstractNumId w:val="4"/>
+  </w:num>
+  <w:num w:numId="7" w16cid:durableId="454255441">
+    <w:abstractNumId w:val="5"/>
+  </w:num>
+  <w:num w:numId="8" w16cid:durableId="1405447370">
     <w:abstractNumId w:val="8"/>
   </w:num>
-  <w:num w:numId="4" w16cid:durableId="2004159467">
-    <w:abstractNumId w:val="2"/>
-  </w:num>
-  <w:num w:numId="5" w16cid:durableId="999313764">
+  <w:num w:numId="9" w16cid:durableId="192622226">
     <w:abstractNumId w:val="10"/>
   </w:num>
-  <w:num w:numId="6" w16cid:durableId="1634479605">
-    <w:abstractNumId w:val="3"/>
+  <w:num w:numId="10" w16cid:durableId="1986932681">
+    <w:abstractNumId w:val="6"/>
   </w:num>
-  <w:num w:numId="7" w16cid:durableId="454255441">
-    <w:abstractNumId w:val="4"/>
+  <w:num w:numId="11" w16cid:durableId="484128773">
+    <w:abstractNumId w:val="12"/>
   </w:num>
-  <w:num w:numId="8" w16cid:durableId="1405447370">
+  <w:num w:numId="12" w16cid:durableId="543912572">
     <w:abstractNumId w:val="7"/>
   </w:num>
-  <w:num w:numId="9" w16cid:durableId="192622226">
-    <w:abstractNumId w:val="9"/>
-  </w:num>
-  <w:num w:numId="10" w16cid:durableId="1986932681">
-    <w:abstractNumId w:val="5"/>
-  </w:num>
-  <w:num w:numId="11" w16cid:durableId="484128773">
-    <w:abstractNumId w:val="11"/>
-  </w:num>
-  <w:num w:numId="12" w16cid:durableId="543912572">
-    <w:abstractNumId w:val="6"/>
+  <w:num w:numId="13" w16cid:durableId="555892456">
+    <w:abstractNumId w:val="0"/>
   </w:num>
 </w:numbering>
 </file>

</xml_diff>